<commit_message>
Fill in Goleman (1998) page number in Repertoire revision
Co-Authored-By: Claude Opus 5.5 <noreply@anthropic.com>
Claude-Session: https://claude.ai/code/session_01L6YgCsfwaES3p7D3sJRq6w
</commit_message>
<xml_diff>
--- a/A2/HOSP7053_A2_Repertoire_修訂版.docx
+++ b/A2/HOSP7053_A2_Repertoire_修訂版.docx
@@ -302,7 +302,7 @@
           <w:highlight w:val="yellow"/>
           <w:highlightCs w:val="yellow"/>
         </w:rPr>
-        <w:t xml:space="preserve">"skill in treating people according to their emotional reactions" (p. [page])</w:t>
+        <w:t xml:space="preserve">"skill in treating people according to their emotional reactions" (p. 95)</w:t>
       </w:r>
       <w:r>
         <w:rPr>
@@ -345,7 +345,7 @@
           <w:highlight w:val="yellow"/>
           <w:highlightCs w:val="yellow"/>
         </w:rPr>
-        <w:t xml:space="preserve">「依照別人的情緒反應來對待他們的技巧」（p. [頁碼]）</w:t>
+        <w:t xml:space="preserve">「依照別人的情緒反應來對待他們的技巧」（p. 95）</w:t>
       </w:r>
       <w:r>
         <w:rPr>
@@ -1057,7 +1057,7 @@
                 <w:sz w:val="20"/>
                 <w:szCs w:val="20"/>
               </w:rPr>
-              <w:t xml:space="preserve">直接引用原文必須標示</w:t>
+              <w:t xml:space="preserve">直接引用原文必須標示，已核對原文在 p. 95</w:t>
             </w:r>
           </w:p>
         </w:tc>
@@ -1462,7 +1462,7 @@
           <w:sz w:val="21"/>
           <w:szCs w:val="21"/>
         </w:rPr>
-        <w:t xml:space="preserve">第 3 段 Goleman 的頁碼 p. [page] 要查原文填上</w:t>
+        <w:t xml:space="preserve">Appendix A 第 5、6、7 列直接引用了 Goleman 的定義，也要加上引號和 (p. 95)，第 7 列的 states as 改成 defines as</w:t>
       </w:r>
     </w:p>
     <w:p>

</xml_diff>